<commit_message>
Pushing to make MVP code more thorough and tested, with human-readable output and verifications (with same propagated to All-Star Level 1)
</commit_message>
<xml_diff>
--- a/Design/All-Star Level 1 - Conversations/2026-08-27 Design Conversations.docx
+++ b/Design/All-Star Level 1 - Conversations/2026-08-27 Design Conversations.docx
@@ -315,6 +315,457 @@
           <w14:ligatures w14:val="none"/>
         </w:rPr>
         <w:t xml:space="preserve"> when you want these changes to apply to live ChatGPT runs.</w:t>
+      </w:r>
+    </w:p>
+    <w:p>
+      <w:pPr>
+        <w:spacing w:before="100" w:beforeAutospacing="1" w:after="100" w:afterAutospacing="1" w:line="240" w:lineRule="auto"/>
+        <w:outlineLvl w:val="4"/>
+        <w:rPr>
+          <w:rFonts w:ascii="Times New Roman" w:eastAsia="Times New Roman" w:hAnsi="Times New Roman" w:cs="Times New Roman"/>
+          <w:b/>
+          <w:bCs/>
+          <w:kern w:val="0"/>
+          <w:sz w:val="20"/>
+          <w:szCs w:val="20"/>
+          <w14:ligatures w14:val="none"/>
+        </w:rPr>
+      </w:pPr>
+      <w:r>
+        <w:rPr>
+          <w:rFonts w:ascii="Times New Roman" w:eastAsia="Times New Roman" w:hAnsi="Times New Roman" w:cs="Times New Roman"/>
+          <w:b/>
+          <w:bCs/>
+          <w:kern w:val="0"/>
+          <w:sz w:val="20"/>
+          <w:szCs w:val="20"/>
+          <w14:ligatures w14:val="none"/>
+        </w:rPr>
+        <w:t>You said:</w:t>
+      </w:r>
+    </w:p>
+    <w:p>
+      <w:pPr>
+        <w:spacing w:after="0" w:line="240" w:lineRule="auto"/>
+        <w:rPr>
+          <w:rFonts w:ascii="Times New Roman" w:eastAsia="Times New Roman" w:hAnsi="Times New Roman" w:cs="Times New Roman"/>
+          <w:kern w:val="0"/>
+          <w14:ligatures w14:val="none"/>
+        </w:rPr>
+      </w:pPr>
+      <w:r>
+        <w:rPr>
+          <w:rFonts w:ascii="Times New Roman" w:eastAsia="Times New Roman" w:hAnsi="Times New Roman" w:cs="Times New Roman"/>
+          <w:kern w:val="0"/>
+          <w14:ligatures w14:val="none"/>
+        </w:rPr>
+        <w:t>MVP Level 1.md</w:t>
+      </w:r>
+    </w:p>
+    <w:p>
+      <w:pPr>
+        <w:spacing w:after="0" w:line="240" w:lineRule="auto"/>
+        <w:rPr>
+          <w:rFonts w:ascii="Times New Roman" w:eastAsia="Times New Roman" w:hAnsi="Times New Roman" w:cs="Times New Roman"/>
+          <w:kern w:val="0"/>
+          <w14:ligatures w14:val="none"/>
+        </w:rPr>
+      </w:pPr>
+      <w:r>
+        <w:rPr>
+          <w:rFonts w:ascii="Times New Roman" w:eastAsia="Times New Roman" w:hAnsi="Times New Roman" w:cs="Times New Roman"/>
+          <w:kern w:val="0"/>
+          <w14:ligatures w14:val="none"/>
+        </w:rPr>
+        <w:t>File</w:t>
+      </w:r>
+    </w:p>
+    <w:p>
+      <w:pPr>
+        <w:spacing w:after="0" w:line="240" w:lineRule="auto"/>
+        <w:rPr>
+          <w:rFonts w:ascii="Times New Roman" w:eastAsia="Times New Roman" w:hAnsi="Times New Roman" w:cs="Times New Roman"/>
+          <w:kern w:val="0"/>
+          <w14:ligatures w14:val="none"/>
+        </w:rPr>
+      </w:pPr>
+      <w:r>
+        <w:rPr>
+          <w:rFonts w:ascii="Times New Roman" w:eastAsia="Times New Roman" w:hAnsi="Times New Roman" w:cs="Times New Roman"/>
+          <w:kern w:val="0"/>
+          <w14:ligatures w14:val="none"/>
+        </w:rPr>
+        <w:t>2026-08-27 Design Conversations.docx</w:t>
+      </w:r>
+    </w:p>
+    <w:p>
+      <w:pPr>
+        <w:spacing w:after="0" w:line="240" w:lineRule="auto"/>
+        <w:rPr>
+          <w:rFonts w:ascii="Times New Roman" w:eastAsia="Times New Roman" w:hAnsi="Times New Roman" w:cs="Times New Roman"/>
+          <w:kern w:val="0"/>
+          <w14:ligatures w14:val="none"/>
+        </w:rPr>
+      </w:pPr>
+      <w:r>
+        <w:rPr>
+          <w:rFonts w:ascii="Times New Roman" w:eastAsia="Times New Roman" w:hAnsi="Times New Roman" w:cs="Times New Roman"/>
+          <w:kern w:val="0"/>
+          <w14:ligatures w14:val="none"/>
+        </w:rPr>
+        <w:t>Document</w:t>
+      </w:r>
+    </w:p>
+    <w:p>
+      <w:pPr>
+        <w:spacing w:after="0" w:line="240" w:lineRule="auto"/>
+        <w:rPr>
+          <w:rFonts w:ascii="Times New Roman" w:eastAsia="Times New Roman" w:hAnsi="Times New Roman" w:cs="Times New Roman"/>
+          <w:kern w:val="0"/>
+          <w14:ligatures w14:val="none"/>
+        </w:rPr>
+      </w:pPr>
+      <w:r>
+        <w:rPr>
+          <w:rFonts w:ascii="Times New Roman" w:eastAsia="Times New Roman" w:hAnsi="Times New Roman" w:cs="Times New Roman"/>
+          <w:kern w:val="0"/>
+          <w14:ligatures w14:val="none"/>
+        </w:rPr>
+        <w:t>Ok, I've made even more edits to MVP Level 1 now - see the latest MVP Level 1 and conversation, and update All-Star Level 1</w:t>
+      </w:r>
+    </w:p>
+    <w:p>
+      <w:pPr>
+        <w:spacing w:before="100" w:beforeAutospacing="1" w:after="100" w:afterAutospacing="1" w:line="240" w:lineRule="auto"/>
+        <w:outlineLvl w:val="5"/>
+        <w:rPr>
+          <w:rFonts w:ascii="Times New Roman" w:eastAsia="Times New Roman" w:hAnsi="Times New Roman" w:cs="Times New Roman"/>
+          <w:b/>
+          <w:bCs/>
+          <w:kern w:val="0"/>
+          <w:sz w:val="15"/>
+          <w:szCs w:val="15"/>
+          <w14:ligatures w14:val="none"/>
+        </w:rPr>
+      </w:pPr>
+      <w:r>
+        <w:rPr>
+          <w:rFonts w:ascii="Times New Roman" w:eastAsia="Times New Roman" w:hAnsi="Times New Roman" w:cs="Times New Roman"/>
+          <w:b/>
+          <w:bCs/>
+          <w:kern w:val="0"/>
+          <w:sz w:val="15"/>
+          <w:szCs w:val="15"/>
+          <w14:ligatures w14:val="none"/>
+        </w:rPr>
+        <w:lastRenderedPageBreak/>
+        <w:t>The assistant said:</w:t>
+      </w:r>
+    </w:p>
+    <w:p>
+      <w:pPr>
+        <w:spacing w:after="0" w:line="240" w:lineRule="auto"/>
+        <w:rPr>
+          <w:rFonts w:ascii="Times New Roman" w:eastAsia="Times New Roman" w:hAnsi="Times New Roman" w:cs="Times New Roman"/>
+          <w:kern w:val="0"/>
+          <w14:ligatures w14:val="none"/>
+        </w:rPr>
+      </w:pPr>
+      <w:r>
+        <w:rPr>
+          <w:rFonts w:ascii="Times New Roman" w:eastAsia="Times New Roman" w:hAnsi="Times New Roman" w:cs="Times New Roman"/>
+          <w:kern w:val="0"/>
+          <w14:ligatures w14:val="none"/>
+        </w:rPr>
+        <w:t>Thought for 13s</w:t>
+      </w:r>
+    </w:p>
+    <w:p>
+      <w:pPr>
+        <w:spacing w:before="100" w:beforeAutospacing="1" w:after="100" w:afterAutospacing="1" w:line="240" w:lineRule="auto"/>
+        <w:rPr>
+          <w:rFonts w:ascii="Times New Roman" w:eastAsia="Times New Roman" w:hAnsi="Times New Roman" w:cs="Times New Roman"/>
+          <w:kern w:val="0"/>
+          <w14:ligatures w14:val="none"/>
+        </w:rPr>
+      </w:pPr>
+      <w:r>
+        <w:rPr>
+          <w:rFonts w:ascii="Times New Roman" w:eastAsia="Times New Roman" w:hAnsi="Times New Roman" w:cs="Times New Roman"/>
+          <w:kern w:val="0"/>
+          <w14:ligatures w14:val="none"/>
+        </w:rPr>
+        <w:t xml:space="preserve">I’ll compare the latest </w:t>
+      </w:r>
+      <w:r>
+        <w:rPr>
+          <w:rFonts w:ascii="Times New Roman" w:eastAsia="Times New Roman" w:hAnsi="Times New Roman" w:cs="Times New Roman"/>
+          <w:b/>
+          <w:bCs/>
+          <w:kern w:val="0"/>
+          <w14:ligatures w14:val="none"/>
+        </w:rPr>
+        <w:t>MVP Level 1</w:t>
+      </w:r>
+      <w:r>
+        <w:rPr>
+          <w:rFonts w:ascii="Times New Roman" w:eastAsia="Times New Roman" w:hAnsi="Times New Roman" w:cs="Times New Roman"/>
+          <w:kern w:val="0"/>
+          <w14:ligatures w14:val="none"/>
+        </w:rPr>
+        <w:t xml:space="preserve"> edits and design conversation against the current All-Star instructions, then fold the matching changes into All-Star Level 1.</w:t>
+      </w:r>
+    </w:p>
+    <w:p>
+      <w:pPr>
+        <w:spacing w:before="100" w:beforeAutospacing="1" w:after="100" w:afterAutospacing="1" w:line="240" w:lineRule="auto"/>
+        <w:rPr>
+          <w:rFonts w:ascii="Times New Roman" w:eastAsia="Times New Roman" w:hAnsi="Times New Roman" w:cs="Times New Roman"/>
+          <w:kern w:val="0"/>
+          <w14:ligatures w14:val="none"/>
+        </w:rPr>
+      </w:pPr>
+      <w:r>
+        <w:rPr>
+          <w:rFonts w:ascii="Times New Roman" w:eastAsia="Times New Roman" w:hAnsi="Times New Roman" w:cs="Times New Roman"/>
+          <w:kern w:val="0"/>
+          <w14:ligatures w14:val="none"/>
+        </w:rPr>
+        <w:t xml:space="preserve">I’m tightening </w:t>
+      </w:r>
+      <w:r>
+        <w:rPr>
+          <w:rFonts w:ascii="Times New Roman" w:eastAsia="Times New Roman" w:hAnsi="Times New Roman" w:cs="Times New Roman"/>
+          <w:b/>
+          <w:bCs/>
+          <w:kern w:val="0"/>
+          <w14:ligatures w14:val="none"/>
+        </w:rPr>
+        <w:t>All-Star Level 1</w:t>
+      </w:r>
+      <w:r>
+        <w:rPr>
+          <w:rFonts w:ascii="Times New Roman" w:eastAsia="Times New Roman" w:hAnsi="Times New Roman" w:cs="Times New Roman"/>
+          <w:kern w:val="0"/>
+          <w14:ligatures w14:val="none"/>
+        </w:rPr>
+        <w:t xml:space="preserve"> around the newest MVP priorities: reliability first, real tests over plausible code, and thorough confidence-building evidence for future package users.</w:t>
+      </w:r>
+    </w:p>
+    <w:p>
+      <w:pPr>
+        <w:spacing w:after="0" w:line="240" w:lineRule="auto"/>
+        <w:rPr>
+          <w:rFonts w:ascii="Times New Roman" w:eastAsia="Times New Roman" w:hAnsi="Times New Roman" w:cs="Times New Roman"/>
+          <w:kern w:val="0"/>
+          <w14:ligatures w14:val="none"/>
+        </w:rPr>
+      </w:pPr>
+      <w:r>
+        <w:rPr>
+          <w:rFonts w:ascii="Times New Roman" w:eastAsia="Times New Roman" w:hAnsi="Times New Roman" w:cs="Times New Roman"/>
+          <w:kern w:val="0"/>
+          <w14:ligatures w14:val="none"/>
+        </w:rPr>
+        <w:t>Updated instructions</w:t>
+      </w:r>
+    </w:p>
+    <w:p>
+      <w:pPr>
+        <w:spacing w:after="0" w:line="240" w:lineRule="auto"/>
+        <w:rPr>
+          <w:rFonts w:ascii="Times New Roman" w:eastAsia="Times New Roman" w:hAnsi="Times New Roman" w:cs="Times New Roman"/>
+          <w:kern w:val="0"/>
+          <w14:ligatures w14:val="none"/>
+        </w:rPr>
+      </w:pPr>
+      <w:r>
+        <w:rPr>
+          <w:rFonts w:ascii="Times New Roman" w:eastAsia="Times New Roman" w:hAnsi="Times New Roman" w:cs="Times New Roman"/>
+          <w:kern w:val="0"/>
+          <w14:ligatures w14:val="none"/>
+        </w:rPr>
+        <w:t>Summary of changes</w:t>
+      </w:r>
+    </w:p>
+    <w:p>
+      <w:pPr>
+        <w:spacing w:before="100" w:beforeAutospacing="1" w:after="100" w:afterAutospacing="1" w:line="240" w:lineRule="auto"/>
+        <w:rPr>
+          <w:rFonts w:ascii="Times New Roman" w:eastAsia="Times New Roman" w:hAnsi="Times New Roman" w:cs="Times New Roman"/>
+          <w:kern w:val="0"/>
+          <w14:ligatures w14:val="none"/>
+        </w:rPr>
+      </w:pPr>
+      <w:r>
+        <w:rPr>
+          <w:rFonts w:ascii="Times New Roman" w:eastAsia="Times New Roman" w:hAnsi="Times New Roman" w:cs="Times New Roman"/>
+          <w:kern w:val="0"/>
+          <w14:ligatures w14:val="none"/>
+        </w:rPr>
+        <w:t>Made tested, reliable, editable expanded package implementation the top priority for All-Star Level 1.</w:t>
+      </w:r>
+    </w:p>
+    <w:p>
+      <w:pPr>
+        <w:spacing w:before="100" w:beforeAutospacing="1" w:after="100" w:afterAutospacing="1" w:line="240" w:lineRule="auto"/>
+        <w:rPr>
+          <w:rFonts w:ascii="Times New Roman" w:eastAsia="Times New Roman" w:hAnsi="Times New Roman" w:cs="Times New Roman"/>
+          <w:kern w:val="0"/>
+          <w14:ligatures w14:val="none"/>
+        </w:rPr>
+      </w:pPr>
+      <w:r>
+        <w:rPr>
+          <w:rFonts w:ascii="Times New Roman" w:eastAsia="Times New Roman" w:hAnsi="Times New Roman" w:cs="Times New Roman"/>
+          <w:kern w:val="0"/>
+          <w14:ligatures w14:val="none"/>
+        </w:rPr>
+        <w:t>Strengthened the instruction that All-Star should optimize for code that actually works, not code that merely looks complete.</w:t>
+      </w:r>
+    </w:p>
+    <w:p>
+      <w:pPr>
+        <w:spacing w:before="100" w:beforeAutospacing="1" w:after="100" w:afterAutospacing="1" w:line="240" w:lineRule="auto"/>
+        <w:rPr>
+          <w:rFonts w:ascii="Times New Roman" w:eastAsia="Times New Roman" w:hAnsi="Times New Roman" w:cs="Times New Roman"/>
+          <w:kern w:val="0"/>
+          <w14:ligatures w14:val="none"/>
+        </w:rPr>
+      </w:pPr>
+      <w:r>
+        <w:rPr>
+          <w:rFonts w:ascii="Times New Roman" w:eastAsia="Times New Roman" w:hAnsi="Times New Roman" w:cs="Times New Roman"/>
+          <w:kern w:val="0"/>
+          <w14:ligatures w14:val="none"/>
+        </w:rPr>
+        <w:t>Expanded human-readable evidence requirements so outputs must build confidence that the package was implemented, tested, and is likely to work for future scripts when used as documented.</w:t>
+      </w:r>
+    </w:p>
+    <w:p>
+      <w:pPr>
+        <w:spacing w:before="100" w:beforeAutospacing="1" w:after="100" w:afterAutospacing="1" w:line="240" w:lineRule="auto"/>
+        <w:rPr>
+          <w:rFonts w:ascii="Times New Roman" w:eastAsia="Times New Roman" w:hAnsi="Times New Roman" w:cs="Times New Roman"/>
+          <w:kern w:val="0"/>
+          <w14:ligatures w14:val="none"/>
+        </w:rPr>
+      </w:pPr>
+      <w:r>
+        <w:rPr>
+          <w:rFonts w:ascii="Times New Roman" w:eastAsia="Times New Roman" w:hAnsi="Times New Roman" w:cs="Times New Roman"/>
+          <w:kern w:val="0"/>
+          <w14:ligatures w14:val="none"/>
+        </w:rPr>
+        <w:t>Added practical code-quality checks: fresh package imports, syntax/compilation checks, included tests when present, and exercising public APIs through demo_of_efficacy.py.</w:t>
+      </w:r>
+    </w:p>
+    <w:p>
+      <w:pPr>
+        <w:spacing w:before="100" w:beforeAutospacing="1" w:after="100" w:afterAutospacing="1" w:line="240" w:lineRule="auto"/>
+        <w:rPr>
+          <w:rFonts w:ascii="Times New Roman" w:eastAsia="Times New Roman" w:hAnsi="Times New Roman" w:cs="Times New Roman"/>
+          <w:kern w:val="0"/>
+          <w14:ligatures w14:val="none"/>
+        </w:rPr>
+      </w:pPr>
+      <w:r>
+        <w:rPr>
+          <w:rFonts w:ascii="Times New Roman" w:eastAsia="Times New Roman" w:hAnsi="Times New Roman" w:cs="Times New Roman"/>
+          <w:kern w:val="0"/>
+          <w14:ligatures w14:val="none"/>
+        </w:rPr>
+        <w:t>Expanded package-usage-guide.md expectations with demo-evidence links, common setup mistakes, and simple checks for non-software-developer lab users.</w:t>
+      </w:r>
+    </w:p>
+    <w:p>
+      <w:pPr>
+        <w:spacing w:before="100" w:beforeAutospacing="1" w:after="100" w:afterAutospacing="1" w:line="240" w:lineRule="auto"/>
+        <w:rPr>
+          <w:rFonts w:ascii="Times New Roman" w:eastAsia="Times New Roman" w:hAnsi="Times New Roman" w:cs="Times New Roman"/>
+          <w:kern w:val="0"/>
+          <w14:ligatures w14:val="none"/>
+        </w:rPr>
+      </w:pPr>
+      <w:r>
+        <w:rPr>
+          <w:rFonts w:ascii="Times New Roman" w:eastAsia="Times New Roman" w:hAnsi="Times New Roman" w:cs="Times New Roman"/>
+          <w:kern w:val="0"/>
+          <w14:ligatures w14:val="none"/>
+        </w:rPr>
+        <w:t>Expanded run-summary requirements to report APIs exercised, expected vs. observed evidence, artifact explanations, restoration confirmation, independent sanity checks, confidence level, and untested areas.</w:t>
+      </w:r>
+    </w:p>
+    <w:p>
+      <w:pPr>
+        <w:spacing w:before="100" w:beforeAutospacing="1" w:after="100" w:afterAutospacing="1" w:line="240" w:lineRule="auto"/>
+        <w:rPr>
+          <w:rFonts w:ascii="Times New Roman" w:eastAsia="Times New Roman" w:hAnsi="Times New Roman" w:cs="Times New Roman"/>
+          <w:kern w:val="0"/>
+          <w14:ligatures w14:val="none"/>
+        </w:rPr>
+      </w:pPr>
+      <w:r>
+        <w:rPr>
+          <w:rFonts w:ascii="Times New Roman" w:eastAsia="Times New Roman" w:hAnsi="Times New Roman" w:cs="Times New Roman"/>
+          <w:kern w:val="0"/>
+          <w14:ligatures w14:val="none"/>
+        </w:rPr>
+        <w:t>Added safety guidance that plausible-looking code must not substitute for real tests, imports, demo execution, readbacks, or other evidence.</w:t>
+      </w:r>
+    </w:p>
+    <w:p>
+      <w:pPr>
+        <w:spacing w:before="100" w:beforeAutospacing="1" w:after="100" w:afterAutospacing="1" w:line="240" w:lineRule="auto"/>
+        <w:rPr>
+          <w:rFonts w:ascii="Times New Roman" w:eastAsia="Times New Roman" w:hAnsi="Times New Roman" w:cs="Times New Roman"/>
+          <w:kern w:val="0"/>
+          <w14:ligatures w14:val="none"/>
+        </w:rPr>
+      </w:pPr>
+      <w:r>
+        <w:rPr>
+          <w:rFonts w:ascii="Times New Roman" w:eastAsia="Times New Roman" w:hAnsi="Times New Roman" w:cs="Times New Roman"/>
+          <w:kern w:val="0"/>
+          <w14:ligatures w14:val="none"/>
+        </w:rPr>
+        <w:t>All-Star Level 1 now reflects the latest MVP reliability and evidence edits.</w:t>
+      </w:r>
+    </w:p>
+    <w:p>
+      <w:pPr>
+        <w:spacing w:before="100" w:beforeAutospacing="1" w:after="100" w:afterAutospacing="1" w:line="240" w:lineRule="auto"/>
+        <w:rPr>
+          <w:rFonts w:ascii="Times New Roman" w:eastAsia="Times New Roman" w:hAnsi="Times New Roman" w:cs="Times New Roman"/>
+          <w:kern w:val="0"/>
+          <w14:ligatures w14:val="none"/>
+        </w:rPr>
+      </w:pPr>
+      <w:r>
+        <w:rPr>
+          <w:rFonts w:ascii="Times New Roman" w:eastAsia="Times New Roman" w:hAnsi="Times New Roman" w:cs="Times New Roman"/>
+          <w:kern w:val="0"/>
+          <w14:ligatures w14:val="none"/>
+        </w:rPr>
+        <w:t xml:space="preserve">The draft still needs </w:t>
+      </w:r>
+      <w:r>
+        <w:rPr>
+          <w:rFonts w:ascii="Times New Roman" w:eastAsia="Times New Roman" w:hAnsi="Times New Roman" w:cs="Times New Roman"/>
+          <w:b/>
+          <w:bCs/>
+          <w:kern w:val="0"/>
+          <w14:ligatures w14:val="none"/>
+        </w:rPr>
+        <w:t>Update</w:t>
+      </w:r>
+      <w:r>
+        <w:rPr>
+          <w:rFonts w:ascii="Times New Roman" w:eastAsia="Times New Roman" w:hAnsi="Times New Roman" w:cs="Times New Roman"/>
+          <w:kern w:val="0"/>
+          <w14:ligatures w14:val="none"/>
+        </w:rPr>
+        <w:t xml:space="preserve"> before live ChatGPT runs use these changes.</w:t>
       </w:r>
     </w:p>
     <w:p/>
@@ -326,6 +777,163 @@
     </w:sectPr>
   </w:body>
 </w:document>
+</file>
+
+<file path=word/numbering.xml><?xml version="1.0" encoding="utf-8"?>
+<w:numbering xmlns:wpc="http://schemas.microsoft.com/office/word/2010/wordprocessingCanvas" xmlns:cx="http://schemas.microsoft.com/office/drawing/2014/chartex" xmlns:cx1="http://schemas.microsoft.com/office/drawing/2015/9/8/chartex" xmlns:cx2="http://schemas.microsoft.com/office/drawing/2015/10/21/chartex" xmlns:cx3="http://schemas.microsoft.com/office/drawing/2016/5/9/chartex" xmlns:cx4="http://schemas.microsoft.com/office/drawing/2016/5/10/chartex" xmlns:cx5="http://schemas.microsoft.com/office/drawing/2016/5/11/chartex" xmlns:cx6="http://schemas.microsoft.com/office/drawing/2016/5/12/chartex" xmlns:cx7="http://schemas.microsoft.com/office/drawing/2016/5/13/chartex" xmlns:cx8="http://schemas.microsoft.com/office/drawing/2016/5/14/chartex" xmlns:mc="http://schemas.openxmlformats.org/markup-compatibility/2006" xmlns:aink="http://schemas.microsoft.com/office/drawing/2016/ink" xmlns:am3d="http://schemas.microsoft.com/office/drawing/2017/model3d" xmlns:o="urn:schemas-microsoft-com:office:office" xmlns:oel="http://schemas.microsoft.com/office/2019/extlst" xmlns:r="http://schemas.openxmlformats.org/officeDocument/2006/relationships" xmlns:m="http://schemas.openxmlformats.org/officeDocument/2006/math" xmlns:v="urn:schemas-microsoft-com:vml" xmlns:wp14="http://schemas.microsoft.com/office/word/2010/wordprocessingDrawing" xmlns:wp="http://schemas.openxmlformats.org/drawingml/2006/wordprocessingDrawing" xmlns:w10="urn:schemas-microsoft-com:office:word" xmlns:w="http://schemas.openxmlformats.org/wordprocessingml/2006/main" xmlns:w14="http://schemas.microsoft.com/office/word/2010/wordml" xmlns:w15="http://schemas.microsoft.com/office/word/2012/wordml" xmlns:w16cei="http://schemas.microsoft.com/office/word/2026/wordml/cei" xmlns:w16cex="http://schemas.microsoft.com/office/word/2018/wordml/cex" xmlns:w16cid="http://schemas.microsoft.com/office/word/2016/wordml/cid" xmlns:w16="http://schemas.microsoft.com/office/word/2018/wordml" xmlns:w16du="http://schemas.microsoft.com/office/word/2023/wordml/word16du" xmlns:w16sdtdh="http://schemas.microsoft.com/office/word/2020/wordml/sdtdatahash" xmlns:w16sdtfl="http://schemas.microsoft.com/office/word/2024/wordml/sdtformatlock" xmlns:w16se="http://schemas.microsoft.com/office/word/2015/wordml/symex" xmlns:wpg="http://schemas.microsoft.com/office/word/2010/wordprocessingGroup" xmlns:wpi="http://schemas.microsoft.com/office/word/2010/wordprocessingInk" xmlns:wne="http://schemas.microsoft.com/office/word/2006/wordml" xmlns:wps="http://schemas.microsoft.com/office/word/2010/wordprocessingShape" mc:Ignorable="w14 w15 w16se w16cid w16 w16cex w16sdtdh w16sdtfl w16du wp14">
+  <w:abstractNum w:abstractNumId="0" w15:restartNumberingAfterBreak="0">
+    <w:nsid w:val="7D201905"/>
+    <w:multiLevelType w:val="multilevel"/>
+    <w:tmpl w:val="B3DEBFC2"/>
+    <w:lvl w:ilvl="0">
+      <w:start w:val="1"/>
+      <w:numFmt w:val="bullet"/>
+      <w:lvlText w:val=""/>
+      <w:lvlJc w:val="left"/>
+      <w:pPr>
+        <w:tabs>
+          <w:tab w:val="num" w:pos="720"/>
+        </w:tabs>
+        <w:ind w:left="720" w:hanging="360"/>
+      </w:pPr>
+      <w:rPr>
+        <w:rFonts w:ascii="Symbol" w:hAnsi="Symbol" w:hint="default"/>
+        <w:sz w:val="20"/>
+      </w:rPr>
+    </w:lvl>
+    <w:lvl w:ilvl="1" w:tentative="1">
+      <w:start w:val="1"/>
+      <w:numFmt w:val="bullet"/>
+      <w:lvlText w:val="o"/>
+      <w:lvlJc w:val="left"/>
+      <w:pPr>
+        <w:tabs>
+          <w:tab w:val="num" w:pos="1440"/>
+        </w:tabs>
+        <w:ind w:left="1440" w:hanging="360"/>
+      </w:pPr>
+      <w:rPr>
+        <w:rFonts w:ascii="Courier New" w:hAnsi="Courier New" w:hint="default"/>
+        <w:sz w:val="20"/>
+      </w:rPr>
+    </w:lvl>
+    <w:lvl w:ilvl="2" w:tentative="1">
+      <w:start w:val="1"/>
+      <w:numFmt w:val="bullet"/>
+      <w:lvlText w:val=""/>
+      <w:lvlJc w:val="left"/>
+      <w:pPr>
+        <w:tabs>
+          <w:tab w:val="num" w:pos="2160"/>
+        </w:tabs>
+        <w:ind w:left="2160" w:hanging="360"/>
+      </w:pPr>
+      <w:rPr>
+        <w:rFonts w:ascii="Wingdings" w:hAnsi="Wingdings" w:hint="default"/>
+        <w:sz w:val="20"/>
+      </w:rPr>
+    </w:lvl>
+    <w:lvl w:ilvl="3" w:tentative="1">
+      <w:start w:val="1"/>
+      <w:numFmt w:val="bullet"/>
+      <w:lvlText w:val=""/>
+      <w:lvlJc w:val="left"/>
+      <w:pPr>
+        <w:tabs>
+          <w:tab w:val="num" w:pos="2880"/>
+        </w:tabs>
+        <w:ind w:left="2880" w:hanging="360"/>
+      </w:pPr>
+      <w:rPr>
+        <w:rFonts w:ascii="Wingdings" w:hAnsi="Wingdings" w:hint="default"/>
+        <w:sz w:val="20"/>
+      </w:rPr>
+    </w:lvl>
+    <w:lvl w:ilvl="4" w:tentative="1">
+      <w:start w:val="1"/>
+      <w:numFmt w:val="bullet"/>
+      <w:lvlText w:val=""/>
+      <w:lvlJc w:val="left"/>
+      <w:pPr>
+        <w:tabs>
+          <w:tab w:val="num" w:pos="3600"/>
+        </w:tabs>
+        <w:ind w:left="3600" w:hanging="360"/>
+      </w:pPr>
+      <w:rPr>
+        <w:rFonts w:ascii="Wingdings" w:hAnsi="Wingdings" w:hint="default"/>
+        <w:sz w:val="20"/>
+      </w:rPr>
+    </w:lvl>
+    <w:lvl w:ilvl="5" w:tentative="1">
+      <w:start w:val="1"/>
+      <w:numFmt w:val="bullet"/>
+      <w:lvlText w:val=""/>
+      <w:lvlJc w:val="left"/>
+      <w:pPr>
+        <w:tabs>
+          <w:tab w:val="num" w:pos="4320"/>
+        </w:tabs>
+        <w:ind w:left="4320" w:hanging="360"/>
+      </w:pPr>
+      <w:rPr>
+        <w:rFonts w:ascii="Wingdings" w:hAnsi="Wingdings" w:hint="default"/>
+        <w:sz w:val="20"/>
+      </w:rPr>
+    </w:lvl>
+    <w:lvl w:ilvl="6" w:tentative="1">
+      <w:start w:val="1"/>
+      <w:numFmt w:val="bullet"/>
+      <w:lvlText w:val=""/>
+      <w:lvlJc w:val="left"/>
+      <w:pPr>
+        <w:tabs>
+          <w:tab w:val="num" w:pos="5040"/>
+        </w:tabs>
+        <w:ind w:left="5040" w:hanging="360"/>
+      </w:pPr>
+      <w:rPr>
+        <w:rFonts w:ascii="Wingdings" w:hAnsi="Wingdings" w:hint="default"/>
+        <w:sz w:val="20"/>
+      </w:rPr>
+    </w:lvl>
+    <w:lvl w:ilvl="7" w:tentative="1">
+      <w:start w:val="1"/>
+      <w:numFmt w:val="bullet"/>
+      <w:lvlText w:val=""/>
+      <w:lvlJc w:val="left"/>
+      <w:pPr>
+        <w:tabs>
+          <w:tab w:val="num" w:pos="5760"/>
+        </w:tabs>
+        <w:ind w:left="5760" w:hanging="360"/>
+      </w:pPr>
+      <w:rPr>
+        <w:rFonts w:ascii="Wingdings" w:hAnsi="Wingdings" w:hint="default"/>
+        <w:sz w:val="20"/>
+      </w:rPr>
+    </w:lvl>
+    <w:lvl w:ilvl="8" w:tentative="1">
+      <w:start w:val="1"/>
+      <w:numFmt w:val="bullet"/>
+      <w:lvlText w:val=""/>
+      <w:lvlJc w:val="left"/>
+      <w:pPr>
+        <w:tabs>
+          <w:tab w:val="num" w:pos="6480"/>
+        </w:tabs>
+        <w:ind w:left="6480" w:hanging="360"/>
+      </w:pPr>
+      <w:rPr>
+        <w:rFonts w:ascii="Wingdings" w:hAnsi="Wingdings" w:hint="default"/>
+        <w:sz w:val="20"/>
+      </w:rPr>
+    </w:lvl>
+  </w:abstractNum>
+  <w:num w:numId="1" w16cid:durableId="353653976">
+    <w:abstractNumId w:val="0"/>
+  </w:num>
+</w:numbering>
 </file>
 
 <file path=word/styles.xml><?xml version="1.0" encoding="utf-8"?>
@@ -825,7 +1433,6 @@
     <w:next w:val="Normal"/>
     <w:link w:val="Heading5Char"/>
     <w:uiPriority w:val="9"/>
-    <w:semiHidden/>
     <w:unhideWhenUsed/>
     <w:qFormat/>
     <w:rsid w:val="003D680C"/>
@@ -1014,7 +1621,6 @@
     <w:basedOn w:val="DefaultParagraphFont"/>
     <w:link w:val="Heading5"/>
     <w:uiPriority w:val="9"/>
-    <w:semiHidden/>
     <w:rsid w:val="003D680C"/>
     <w:rPr>
       <w:rFonts w:eastAsiaTheme="majorEastAsia" w:cstheme="majorBidi"/>
@@ -1279,6 +1885,24 @@
     <w:name w:val="_5wecz"/>
     <w:basedOn w:val="DefaultParagraphFont"/>
     <w:rsid w:val="007A4235"/>
+  </w:style>
+  <w:style w:type="character" w:styleId="HTMLCode">
+    <w:name w:val="HTML Code"/>
+    <w:basedOn w:val="DefaultParagraphFont"/>
+    <w:uiPriority w:val="99"/>
+    <w:semiHidden/>
+    <w:unhideWhenUsed/>
+    <w:rsid w:val="007B4AC3"/>
+    <w:rPr>
+      <w:rFonts w:ascii="Courier New" w:eastAsia="Times New Roman" w:hAnsi="Courier New" w:cs="Courier New"/>
+      <w:sz w:val="20"/>
+      <w:szCs w:val="20"/>
+    </w:rPr>
+  </w:style>
+  <w:style w:type="character" w:customStyle="1" w:styleId="kz98q">
+    <w:name w:val="kz98q"/>
+    <w:basedOn w:val="DefaultParagraphFont"/>
+    <w:rsid w:val="007B4AC3"/>
   </w:style>
 </w:styles>
 </file>

</xml_diff>

<commit_message>
Renamed some instructions without using git mv; modifying some old agent stages to make them chattier rather than outputting only markdown instructions
</commit_message>
<xml_diff>
--- a/Design/All-Star Level 1 - Conversations/2026-08-27 Design Conversations.docx
+++ b/Design/All-Star Level 1 - Conversations/2026-08-27 Design Conversations.docx
@@ -766,6 +766,258 @@
           <w14:ligatures w14:val="none"/>
         </w:rPr>
         <w:t xml:space="preserve"> before live ChatGPT runs use these changes.</w:t>
+      </w:r>
+    </w:p>
+    <w:p>
+      <w:pPr>
+        <w:rPr>
+          <w:rFonts w:ascii="Times New Roman" w:eastAsia="Times New Roman" w:hAnsi="Times New Roman" w:cs="Times New Roman"/>
+          <w:kern w:val="0"/>
+          <w14:ligatures w14:val="none"/>
+        </w:rPr>
+      </w:pPr>
+      <w:r>
+        <w:br/>
+      </w:r>
+      <w:r>
+        <w:br/>
+      </w:r>
+      <w:r>
+        <w:br/>
+      </w:r>
+      <w:r>
+        <w:rPr>
+          <w:rFonts w:ascii="Times New Roman" w:eastAsia="Times New Roman" w:hAnsi="Times New Roman" w:cs="Times New Roman"/>
+          <w:kern w:val="0"/>
+          <w14:ligatures w14:val="none"/>
+        </w:rPr>
+        <w:t>I did one more round of edits on MVP Level 1, mostly to encourage writing settings as helpful during testing</w:t>
+      </w:r>
+    </w:p>
+    <w:p>
+      <w:pPr>
+        <w:spacing w:before="100" w:beforeAutospacing="1" w:after="100" w:afterAutospacing="1" w:line="240" w:lineRule="auto"/>
+        <w:outlineLvl w:val="5"/>
+        <w:rPr>
+          <w:rFonts w:ascii="Times New Roman" w:eastAsia="Times New Roman" w:hAnsi="Times New Roman" w:cs="Times New Roman"/>
+          <w:b/>
+          <w:bCs/>
+          <w:kern w:val="0"/>
+          <w:sz w:val="15"/>
+          <w:szCs w:val="15"/>
+          <w14:ligatures w14:val="none"/>
+        </w:rPr>
+      </w:pPr>
+      <w:r>
+        <w:rPr>
+          <w:rFonts w:ascii="Times New Roman" w:eastAsia="Times New Roman" w:hAnsi="Times New Roman" w:cs="Times New Roman"/>
+          <w:b/>
+          <w:bCs/>
+          <w:kern w:val="0"/>
+          <w:sz w:val="15"/>
+          <w:szCs w:val="15"/>
+          <w14:ligatures w14:val="none"/>
+        </w:rPr>
+        <w:lastRenderedPageBreak/>
+        <w:t>The assistant said:</w:t>
+      </w:r>
+    </w:p>
+    <w:p>
+      <w:pPr>
+        <w:spacing w:after="0" w:line="240" w:lineRule="auto"/>
+        <w:rPr>
+          <w:rFonts w:ascii="Times New Roman" w:eastAsia="Times New Roman" w:hAnsi="Times New Roman" w:cs="Times New Roman"/>
+          <w:kern w:val="0"/>
+          <w14:ligatures w14:val="none"/>
+        </w:rPr>
+      </w:pPr>
+      <w:r>
+        <w:rPr>
+          <w:rFonts w:ascii="Times New Roman" w:eastAsia="Times New Roman" w:hAnsi="Times New Roman" w:cs="Times New Roman"/>
+          <w:kern w:val="0"/>
+          <w14:ligatures w14:val="none"/>
+        </w:rPr>
+        <w:t>Thought for 15s</w:t>
+      </w:r>
+    </w:p>
+    <w:p>
+      <w:pPr>
+        <w:spacing w:before="100" w:beforeAutospacing="1" w:after="100" w:afterAutospacing="1" w:line="240" w:lineRule="auto"/>
+        <w:rPr>
+          <w:rFonts w:ascii="Times New Roman" w:eastAsia="Times New Roman" w:hAnsi="Times New Roman" w:cs="Times New Roman"/>
+          <w:kern w:val="0"/>
+          <w14:ligatures w14:val="none"/>
+        </w:rPr>
+      </w:pPr>
+      <w:r>
+        <w:rPr>
+          <w:rFonts w:ascii="Times New Roman" w:eastAsia="Times New Roman" w:hAnsi="Times New Roman" w:cs="Times New Roman"/>
+          <w:kern w:val="0"/>
+          <w14:ligatures w14:val="none"/>
+        </w:rPr>
+        <w:t>I’ll compare the updated MVP Level 1 instructions and fold the relevant “write settings during testing” guidance into All-Star Level 1 without attaching the file as agent context.</w:t>
+      </w:r>
+    </w:p>
+    <w:p>
+      <w:pPr>
+        <w:spacing w:before="100" w:beforeAutospacing="1" w:after="100" w:afterAutospacing="1" w:line="240" w:lineRule="auto"/>
+        <w:rPr>
+          <w:rFonts w:ascii="Times New Roman" w:eastAsia="Times New Roman" w:hAnsi="Times New Roman" w:cs="Times New Roman"/>
+          <w:kern w:val="0"/>
+          <w14:ligatures w14:val="none"/>
+        </w:rPr>
+      </w:pPr>
+      <w:r>
+        <w:rPr>
+          <w:rFonts w:ascii="Times New Roman" w:eastAsia="Times New Roman" w:hAnsi="Times New Roman" w:cs="Times New Roman"/>
+          <w:kern w:val="0"/>
+          <w14:ligatures w14:val="none"/>
+        </w:rPr>
+        <w:t>The current All-Star instructions already include most of the package/demo and evidence changes. I’ll make a focused update to emphasize that safe, documented, reversible settings writes are encouraged when they meaningfully prove control—not just optional.</w:t>
+      </w:r>
+    </w:p>
+    <w:p>
+      <w:pPr>
+        <w:spacing w:after="0" w:line="240" w:lineRule="auto"/>
+        <w:rPr>
+          <w:rFonts w:ascii="Times New Roman" w:eastAsia="Times New Roman" w:hAnsi="Times New Roman" w:cs="Times New Roman"/>
+          <w:kern w:val="0"/>
+          <w14:ligatures w14:val="none"/>
+        </w:rPr>
+      </w:pPr>
+      <w:r>
+        <w:rPr>
+          <w:rFonts w:ascii="Times New Roman" w:eastAsia="Times New Roman" w:hAnsi="Times New Roman" w:cs="Times New Roman"/>
+          <w:kern w:val="0"/>
+          <w14:ligatures w14:val="none"/>
+        </w:rPr>
+        <w:t>Updated instructions</w:t>
+      </w:r>
+    </w:p>
+    <w:p>
+      <w:pPr>
+        <w:spacing w:after="0" w:line="240" w:lineRule="auto"/>
+        <w:rPr>
+          <w:rFonts w:ascii="Times New Roman" w:eastAsia="Times New Roman" w:hAnsi="Times New Roman" w:cs="Times New Roman"/>
+          <w:kern w:val="0"/>
+          <w14:ligatures w14:val="none"/>
+        </w:rPr>
+      </w:pPr>
+      <w:r>
+        <w:rPr>
+          <w:rFonts w:ascii="Times New Roman" w:eastAsia="Times New Roman" w:hAnsi="Times New Roman" w:cs="Times New Roman"/>
+          <w:kern w:val="0"/>
+          <w14:ligatures w14:val="none"/>
+        </w:rPr>
+        <w:t>Summary of changes</w:t>
+      </w:r>
+    </w:p>
+    <w:p>
+      <w:pPr>
+        <w:spacing w:before="100" w:beforeAutospacing="1" w:after="100" w:afterAutospacing="1" w:line="240" w:lineRule="auto"/>
+        <w:rPr>
+          <w:rFonts w:ascii="Times New Roman" w:eastAsia="Times New Roman" w:hAnsi="Times New Roman" w:cs="Times New Roman"/>
+          <w:kern w:val="0"/>
+          <w14:ligatures w14:val="none"/>
+        </w:rPr>
+      </w:pPr>
+      <w:r>
+        <w:rPr>
+          <w:rFonts w:ascii="Times New Roman" w:eastAsia="Times New Roman" w:hAnsi="Times New Roman" w:cs="Times New Roman"/>
+          <w:kern w:val="0"/>
+          <w14:ligatures w14:val="none"/>
+        </w:rPr>
+        <w:t xml:space="preserve">Updated the All-Star Level 1 instructions to more strongly encourage safe, documented, reversible settings </w:t>
+      </w:r>
+      <w:proofErr w:type="gramStart"/>
+      <w:r>
+        <w:rPr>
+          <w:rFonts w:ascii="Times New Roman" w:eastAsia="Times New Roman" w:hAnsi="Times New Roman" w:cs="Times New Roman"/>
+          <w:kern w:val="0"/>
+          <w14:ligatures w14:val="none"/>
+        </w:rPr>
+        <w:t>writes</w:t>
+      </w:r>
+      <w:proofErr w:type="gramEnd"/>
+      <w:r>
+        <w:rPr>
+          <w:rFonts w:ascii="Times New Roman" w:eastAsia="Times New Roman" w:hAnsi="Times New Roman" w:cs="Times New Roman"/>
+          <w:kern w:val="0"/>
+          <w14:ligatures w14:val="none"/>
+        </w:rPr>
+        <w:t xml:space="preserve"> when they prove real device control.</w:t>
+      </w:r>
+    </w:p>
+    <w:p>
+      <w:pPr>
+        <w:spacing w:before="100" w:beforeAutospacing="1" w:after="100" w:afterAutospacing="1" w:line="240" w:lineRule="auto"/>
+        <w:rPr>
+          <w:rFonts w:ascii="Times New Roman" w:eastAsia="Times New Roman" w:hAnsi="Times New Roman" w:cs="Times New Roman"/>
+          <w:kern w:val="0"/>
+          <w14:ligatures w14:val="none"/>
+        </w:rPr>
+      </w:pPr>
+      <w:r>
+        <w:rPr>
+          <w:rFonts w:ascii="Times New Roman" w:eastAsia="Times New Roman" w:hAnsi="Times New Roman" w:cs="Times New Roman"/>
+          <w:kern w:val="0"/>
+          <w14:ligatures w14:val="none"/>
+        </w:rPr>
+        <w:t>Clarified that set/get demonstrations should capture before values, requested writes, readback verification, and restoration evidence.</w:t>
+      </w:r>
+    </w:p>
+    <w:p>
+      <w:pPr>
+        <w:spacing w:before="100" w:beforeAutospacing="1" w:after="100" w:afterAutospacing="1" w:line="240" w:lineRule="auto"/>
+        <w:rPr>
+          <w:rFonts w:ascii="Times New Roman" w:eastAsia="Times New Roman" w:hAnsi="Times New Roman" w:cs="Times New Roman"/>
+          <w:kern w:val="0"/>
+          <w14:ligatures w14:val="none"/>
+        </w:rPr>
+      </w:pPr>
+      <w:r>
+        <w:rPr>
+          <w:rFonts w:ascii="Times New Roman" w:eastAsia="Times New Roman" w:hAnsi="Times New Roman" w:cs="Times New Roman"/>
+          <w:kern w:val="0"/>
+          <w14:ligatures w14:val="none"/>
+        </w:rPr>
+        <w:t>Fixed a formatting typo in the chat-output contract.</w:t>
+      </w:r>
+    </w:p>
+    <w:p>
+      <w:pPr>
+        <w:spacing w:before="100" w:beforeAutospacing="1" w:after="100" w:afterAutospacing="1" w:line="240" w:lineRule="auto"/>
+        <w:rPr>
+          <w:rFonts w:ascii="Times New Roman" w:eastAsia="Times New Roman" w:hAnsi="Times New Roman" w:cs="Times New Roman"/>
+          <w:kern w:val="0"/>
+          <w14:ligatures w14:val="none"/>
+        </w:rPr>
+      </w:pPr>
+      <w:r>
+        <w:rPr>
+          <w:rFonts w:ascii="Times New Roman" w:eastAsia="Times New Roman" w:hAnsi="Times New Roman" w:cs="Times New Roman"/>
+          <w:kern w:val="0"/>
+          <w14:ligatures w14:val="none"/>
+        </w:rPr>
+        <w:t xml:space="preserve">These edits are saved to the draft. Since the agent already has a live version and the draft now differs from live, click </w:t>
+      </w:r>
+      <w:r>
+        <w:rPr>
+          <w:rFonts w:ascii="Times New Roman" w:eastAsia="Times New Roman" w:hAnsi="Times New Roman" w:cs="Times New Roman"/>
+          <w:b/>
+          <w:bCs/>
+          <w:kern w:val="0"/>
+          <w14:ligatures w14:val="none"/>
+        </w:rPr>
+        <w:t>Update</w:t>
+      </w:r>
+      <w:r>
+        <w:rPr>
+          <w:rFonts w:ascii="Times New Roman" w:eastAsia="Times New Roman" w:hAnsi="Times New Roman" w:cs="Times New Roman"/>
+          <w:kern w:val="0"/>
+          <w14:ligatures w14:val="none"/>
+        </w:rPr>
+        <w:t xml:space="preserve"> when you want these latest instruction changes to apply to normal runs.</w:t>
       </w:r>
     </w:p>
     <w:p/>

</xml_diff>